<commit_message>
Resume: add digital 도장(하현제인) stamp, photo box, fix career to 27yr (1999~)
- 도장 PNG 생성(assets/stamp.png) 후 서명란 날인
- 경력 18→27년 정정(1999 면허~), 그중 18년+ 수정란이식 전문
- 우상단 사진란 추가(사진 파일 미확보로 빈 프레임)

https://claude.ai/code/session_01Y6TtAZhVDLaxNYjVmtcmpZ
</commit_message>
<xml_diff>
--- a/deliverables/하현제_이력서.docx
+++ b/deliverables/하현제_이력서.docx
@@ -4,7 +4,7 @@
   <w:body>
     <w:p>
       <w:pPr>
-        <w:spacing w:after="0"/>
+        <w:spacing w:after="80"/>
         <w:jc w:val="center"/>
       </w:pPr>
       <w:r>
@@ -12,66 +12,144 @@
           <w:rFonts w:ascii="Malgun Gothic" w:hAnsi="Malgun Gothic" w:eastAsia="Malgun Gothic"/>
           <w:b/>
           <w:color w:val="142A4A"/>
-          <w:sz w:val="48"/>
+          <w:sz w:val="46"/>
         </w:rPr>
         <w:t>이      력      서</w:t>
       </w:r>
     </w:p>
+    <w:tbl>
+      <w:tblPr>
+        <w:tblW w:type="auto" w:w="0"/>
+        <w:jc w:val="center"/>
+        <w:tblLook w:firstColumn="1" w:firstRow="1" w:lastColumn="0" w:lastRow="0" w:noHBand="0" w:noVBand="1" w:val="04A0"/>
+      </w:tblPr>
+      <w:tblGrid>
+        <w:gridCol w:w="7597"/>
+        <w:gridCol w:w="1701"/>
+      </w:tblGrid>
+      <w:tr>
+        <w:tc>
+          <w:tcPr>
+            <w:tcW w:type="dxa" w:w="5100"/>
+            <w:vAlign w:val="center"/>
+          </w:tcPr>
+          <w:p>
+            <w:r>
+              <w:rPr>
+                <w:rFonts w:ascii="Malgun Gothic" w:hAnsi="Malgun Gothic" w:eastAsia="Malgun Gothic"/>
+                <w:b/>
+                <w:color w:val="142A4A"/>
+                <w:sz w:val="28"/>
+              </w:rPr>
+              <w:t>하 현 제  (河 賢 濟 · Ha, Hyun-jae), D.V.M.</w:t>
+            </w:r>
+          </w:p>
+          <w:p>
+            <w:pPr>
+              <w:spacing w:after="20"/>
+            </w:pPr>
+            <w:r>
+              <w:rPr>
+                <w:rFonts w:ascii="Malgun Gothic" w:hAnsi="Malgun Gothic" w:eastAsia="Malgun Gothic"/>
+                <w:b w:val="0"/>
+                <w:color w:val="1B5E3A"/>
+                <w:sz w:val="19"/>
+              </w:rPr>
+              <w:t>수의사 · 축산생명공학/정밀축산 전문가 · 축산환경·탄소저감 기술개발자 · 건국대 수의과대학 겸임교수</w:t>
+            </w:r>
+          </w:p>
+          <w:p>
+            <w:pPr>
+              <w:spacing w:after="20"/>
+            </w:pPr>
+            <w:r>
+              <w:rPr>
+                <w:rFonts w:ascii="Malgun Gothic" w:hAnsi="Malgun Gothic" w:eastAsia="Malgun Gothic"/>
+                <w:b w:val="0"/>
+                <w:color w:val="555555"/>
+                <w:sz w:val="18"/>
+              </w:rPr>
+              <w:t>생년월일 1973. 10. 25.   |   수의사 면허 제10193호 (1999.02)</w:t>
+            </w:r>
+          </w:p>
+          <w:p>
+            <w:pPr>
+              <w:spacing w:after="20"/>
+            </w:pPr>
+            <w:r>
+              <w:rPr>
+                <w:rFonts w:ascii="Malgun Gothic" w:hAnsi="Malgun Gothic" w:eastAsia="Malgun Gothic"/>
+                <w:b w:val="0"/>
+                <w:color w:val="555555"/>
+                <w:sz w:val="18"/>
+              </w:rPr>
+              <w:t>휴대전화 010-6205-3150   |   이메일 hhj3150@hanmail.net</w:t>
+            </w:r>
+          </w:p>
+          <w:p>
+            <w:pPr>
+              <w:spacing w:after="20"/>
+            </w:pPr>
+            <w:r>
+              <w:rPr>
+                <w:rFonts w:ascii="Malgun Gothic" w:hAnsi="Malgun Gothic" w:eastAsia="Malgun Gothic"/>
+                <w:b w:val="0"/>
+                <w:color w:val="555555"/>
+                <w:sz w:val="18"/>
+              </w:rPr>
+              <w:t>소속 ㈜제네틱스 대표이사 · 송영신목장 대표 · ㈜디투오(D2O) 대표 · 경기 안성</w:t>
+            </w:r>
+          </w:p>
+        </w:tc>
+        <w:tc>
+          <w:tcPr>
+            <w:tcW w:type="dxa" w:w="5100"/>
+            <w:tcBorders>
+              <w:top w:val="single" w:sz="6" w:space="0" w:color="999999"/>
+              <w:left w:val="single" w:sz="6" w:space="0" w:color="999999"/>
+              <w:bottom w:val="single" w:sz="6" w:space="0" w:color="999999"/>
+              <w:right w:val="single" w:sz="6" w:space="0" w:color="999999"/>
+            </w:tcBorders>
+            <w:vAlign w:val="center"/>
+          </w:tcPr>
+          <w:p>
+            <w:pPr>
+              <w:spacing w:after="20" w:before="20"/>
+              <w:jc w:val="center"/>
+            </w:pPr>
+            <w:r/>
+            <w:r>
+              <w:rPr>
+                <w:rFonts w:ascii="Malgun Gothic" w:hAnsi="Malgun Gothic" w:eastAsia="Malgun Gothic"/>
+                <w:b w:val="0"/>
+                <w:color w:val="AAAAAA"/>
+                <w:sz w:val="18"/>
+              </w:rPr>
+              <w:t>사   진</w:t>
+            </w:r>
+            <w:r>
+              <w:br/>
+            </w:r>
+            <w:r>
+              <w:rPr>
+                <w:rFonts w:ascii="Malgun Gothic" w:hAnsi="Malgun Gothic" w:eastAsia="Malgun Gothic"/>
+                <w:b w:val="0"/>
+                <w:color w:val="AAAAAA"/>
+                <w:sz w:val="18"/>
+              </w:rPr>
+              <w:t>3.0 × 3.6 cm</w:t>
+            </w:r>
+          </w:p>
+        </w:tc>
+      </w:tr>
+    </w:tbl>
     <w:p>
       <w:pPr>
-        <w:spacing w:before="80"/>
-      </w:pPr>
-      <w:r>
-        <w:rPr>
-          <w:rFonts w:ascii="Malgun Gothic" w:hAnsi="Malgun Gothic" w:eastAsia="Malgun Gothic"/>
-          <w:b/>
-          <w:color w:val="142A4A"/>
-          <w:sz w:val="26"/>
-        </w:rPr>
-        <w:t>하 현 제  (河 賢 濟 · Ha, Hyun-jae), D.V.M.</w:t>
-      </w:r>
-    </w:p>
-    <w:p>
-      <w:r>
-        <w:rPr>
-          <w:rFonts w:ascii="Malgun Gothic" w:hAnsi="Malgun Gothic" w:eastAsia="Malgun Gothic"/>
-          <w:b w:val="0"/>
-          <w:color w:val="1B5E3A"/>
-          <w:sz w:val="20"/>
-        </w:rPr>
-        <w:t>수의사 · 축산생명공학/정밀축산 전문가 · 축산환경·탄소저감 기술개발자 · 건국대 수의과대학 겸임교수</w:t>
-      </w:r>
-    </w:p>
-    <w:p>
-      <w:pPr>
-        <w:spacing w:after="40"/>
-      </w:pPr>
-      <w:r>
-        <w:rPr>
-          <w:rFonts w:ascii="Malgun Gothic" w:hAnsi="Malgun Gothic" w:eastAsia="Malgun Gothic"/>
-          <w:b w:val="0"/>
-          <w:color w:val="555555"/>
-          <w:sz w:val="18"/>
-        </w:rPr>
-        <w:t>생년월일 1973.10.25 | 수의사 면허 제10193호 | 010-6205-3150 | hhj3150@hanmail.net | 경기 안성</w:t>
-      </w:r>
-    </w:p>
-    <w:p>
-      <w:pPr>
-        <w:spacing w:after="40"/>
+        <w:spacing w:after="0"/>
         <w:pBdr>
           <w:bottom w:val="single" w:sz="8" w:space="1" w:color="1B5E3A"/>
         </w:pBdr>
       </w:pPr>
-      <w:r>
-        <w:rPr>
-          <w:rFonts w:ascii="Malgun Gothic" w:hAnsi="Malgun Gothic" w:eastAsia="Malgun Gothic"/>
-          <w:b w:val="0"/>
-          <w:color w:val="555555"/>
-          <w:sz w:val="18"/>
-        </w:rPr>
-        <w:t>소속 ㈜제네틱스 대표이사 · 송영신목장 대표 · ㈜디투오(D2O) 대표</w:t>
-      </w:r>
     </w:p>
     <w:p>
       <w:pPr>
@@ -100,7 +178,7 @@
           <w:b w:val="0"/>
           <w:sz w:val="21"/>
         </w:rPr>
-        <w:t>경기 안성에서 동물복지·저탄소·경축순환 목장을 직접 운영하는 수의사로, 약 18년간 가축 번식·질병, 축산환경·악취, 탄소저감, ICT·AI 정밀축산을 현장에서 다뤄 왔다. 국무총리·농림축산식품부 장관·경기도지사·경기도의회 의장 표창을 수상하고, 국내 최초 동물복지 젖소농장 인증과 대한민국 최초 젖소 성감별 수정란 수출을 이뤄낸 축산 전 분야 통합 전문가.</w:t>
+        <w:t>1999년 수의사 면허 취득 이후 약 27년간 산업동물 임상에 종사해 온 수의사로, 그중 약 18년 이상 젖소·한우 수정란이식·번식 분야를 전문으로 해 왔다. 경기 안성에서 동물복지·저탄소·경축순환 목장을 직접 운영하며 가축 질병·번식, 축산환경·악취, 탄소저감, ICT·AI 정밀축산을 현장에서 다뤄 왔고, 국무총리·농림축산식품부 장관·경기도지사·경기도의회 의장 표창을 수상했다. 국내 최초 동물복지 젖소농장 인증과 대한민국 최초 젖소 성감별 수정란 수출을 이뤄낸 축산 전 분야 통합 전문가.</w:t>
       </w:r>
     </w:p>
     <w:p>
@@ -151,10 +229,10 @@
         <w:tblLook w:firstColumn="1" w:firstRow="1" w:lastColumn="0" w:lastRow="0" w:noHBand="0" w:noVBand="1" w:val="04A0"/>
       </w:tblPr>
       <w:tblGrid>
-        <w:gridCol w:w="2521"/>
-        <w:gridCol w:w="2521"/>
-        <w:gridCol w:w="2521"/>
-        <w:gridCol w:w="2521"/>
+        <w:gridCol w:w="2550"/>
+        <w:gridCol w:w="2550"/>
+        <w:gridCol w:w="2550"/>
+        <w:gridCol w:w="2550"/>
       </w:tblGrid>
       <w:tr>
         <w:tc>
@@ -880,9 +958,9 @@
         <w:tblLook w:firstColumn="1" w:firstRow="1" w:lastColumn="0" w:lastRow="0" w:noHBand="0" w:noVBand="1" w:val="04A0"/>
       </w:tblPr>
       <w:tblGrid>
-        <w:gridCol w:w="3362"/>
-        <w:gridCol w:w="3362"/>
-        <w:gridCol w:w="3362"/>
+        <w:gridCol w:w="3400"/>
+        <w:gridCol w:w="3400"/>
+        <w:gridCol w:w="3400"/>
       </w:tblGrid>
       <w:tr>
         <w:tc>
@@ -1260,9 +1338,9 @@
         <w:tblLook w:firstColumn="1" w:firstRow="1" w:lastColumn="0" w:lastRow="0" w:noHBand="0" w:noVBand="1" w:val="04A0"/>
       </w:tblPr>
       <w:tblGrid>
-        <w:gridCol w:w="3362"/>
-        <w:gridCol w:w="3362"/>
-        <w:gridCol w:w="3362"/>
+        <w:gridCol w:w="3400"/>
+        <w:gridCol w:w="3400"/>
+        <w:gridCol w:w="3400"/>
       </w:tblGrid>
       <w:tr>
         <w:tc>
@@ -1937,12 +2015,46 @@
           <w:b/>
           <w:sz w:val="22"/>
         </w:rPr>
-        <w:t>작성자 :  하 현 제   (서명 또는 인)</w:t>
+        <w:t xml:space="preserve">작성자 :  하 현 제   </w:t>
+      </w:r>
+      <w:r>
+        <w:drawing>
+          <wp:inline xmlns:a="http://schemas.openxmlformats.org/drawingml/2006/main" xmlns:pic="http://schemas.openxmlformats.org/drawingml/2006/picture">
+            <wp:extent cx="540000" cy="540000"/>
+            <wp:docPr id="1" name="Picture 1"/>
+            <wp:cNvGraphicFramePr>
+              <a:graphicFrameLocks noChangeAspect="1"/>
+            </wp:cNvGraphicFramePr>
+            <a:graphic>
+              <a:graphicData uri="http://schemas.openxmlformats.org/drawingml/2006/picture">
+                <pic:pic>
+                  <pic:nvPicPr>
+                    <pic:cNvPr id="0" name="stamp.png"/>
+                    <pic:cNvPicPr/>
+                  </pic:nvPicPr>
+                  <pic:blipFill>
+                    <a:blip r:embed="rId9"/>
+                    <a:stretch>
+                      <a:fillRect/>
+                    </a:stretch>
+                  </pic:blipFill>
+                  <pic:spPr>
+                    <a:xfrm>
+                      <a:off x="0" y="0"/>
+                      <a:ext cx="540000" cy="540000"/>
+                    </a:xfrm>
+                    <a:prstGeom prst="rect"/>
+                  </pic:spPr>
+                </pic:pic>
+              </a:graphicData>
+            </a:graphic>
+          </wp:inline>
+        </w:drawing>
       </w:r>
     </w:p>
     <w:sectPr>
       <w:pgSz w:w="12240" w:h="15840"/>
-      <w:pgMar w:top="794" w:right="1077" w:bottom="794" w:left="1077" w:header="720" w:footer="720" w:gutter="0"/>
+      <w:pgMar w:top="737" w:right="1020" w:bottom="737" w:left="1020" w:header="720" w:footer="720" w:gutter="0"/>
       <w:cols w:space="720"/>
       <w:docGrid w:linePitch="360"/>
     </w:sectPr>

</xml_diff>

<commit_message>
Resume: set date 2026-06-06, remove stamp (owner to affix), keep empty photo box
https://claude.ai/code/session_01Y6TtAZhVDLaxNYjVmtcmpZ
</commit_message>
<xml_diff>
--- a/deliverables/하현제_이력서.docx
+++ b/deliverables/하현제_이력서.docx
@@ -1993,20 +1993,20 @@
     <w:p>
       <w:pPr>
         <w:spacing w:before="160"/>
-        <w:jc w:val="right"/>
+        <w:jc w:val="center"/>
       </w:pPr>
       <w:r>
         <w:rPr>
           <w:rFonts w:ascii="Malgun Gothic" w:hAnsi="Malgun Gothic" w:eastAsia="Malgun Gothic"/>
           <w:b w:val="0"/>
-          <w:sz w:val="21"/>
+          <w:sz w:val="22"/>
         </w:rPr>
-        <w:t xml:space="preserve">              년       월       일</w:t>
+        <w:t>2026년  6월  6일</w:t>
       </w:r>
     </w:p>
     <w:p>
       <w:pPr>
-        <w:spacing w:before="80"/>
+        <w:spacing w:before="120"/>
         <w:jc w:val="right"/>
       </w:pPr>
       <w:r>
@@ -2015,41 +2015,7 @@
           <w:b/>
           <w:sz w:val="22"/>
         </w:rPr>
-        <w:t xml:space="preserve">작성자 :  하 현 제   </w:t>
-      </w:r>
-      <w:r>
-        <w:drawing>
-          <wp:inline xmlns:a="http://schemas.openxmlformats.org/drawingml/2006/main" xmlns:pic="http://schemas.openxmlformats.org/drawingml/2006/picture">
-            <wp:extent cx="540000" cy="540000"/>
-            <wp:docPr id="1" name="Picture 1"/>
-            <wp:cNvGraphicFramePr>
-              <a:graphicFrameLocks noChangeAspect="1"/>
-            </wp:cNvGraphicFramePr>
-            <a:graphic>
-              <a:graphicData uri="http://schemas.openxmlformats.org/drawingml/2006/picture">
-                <pic:pic>
-                  <pic:nvPicPr>
-                    <pic:cNvPr id="0" name="stamp.png"/>
-                    <pic:cNvPicPr/>
-                  </pic:nvPicPr>
-                  <pic:blipFill>
-                    <a:blip r:embed="rId9"/>
-                    <a:stretch>
-                      <a:fillRect/>
-                    </a:stretch>
-                  </pic:blipFill>
-                  <pic:spPr>
-                    <a:xfrm>
-                      <a:off x="0" y="0"/>
-                      <a:ext cx="540000" cy="540000"/>
-                    </a:xfrm>
-                    <a:prstGeom prst="rect"/>
-                  </pic:spPr>
-                </pic:pic>
-              </a:graphicData>
-            </a:graphic>
-          </wp:inline>
-        </w:drawing>
+        <w:t xml:space="preserve">작성자 :  하 현 제   (인)        </w:t>
       </w:r>
     </w:p>
     <w:sectPr>

</xml_diff>